<commit_message>
doc(Rapport.docx): Finalisation de la planification
[20][DONE]
Finalisation de la planification jusqu'à la semaine 8
</commit_message>
<xml_diff>
--- a/docs/R-320-POO-SchmidNathan-Rapport.docx
+++ b/docs/R-320-POO-SchmidNathan-Rapport.docx
@@ -8,15 +8,7 @@
         <w:jc w:val="center"/>
       </w:pPr>
       <w:r>
-        <w:t xml:space="preserve">POO </w:t>
-      </w:r>
-      <w:proofErr w:type="spellStart"/>
-      <w:r>
-        <w:t>Shoot’Em</w:t>
-      </w:r>
-      <w:proofErr w:type="spellEnd"/>
-      <w:r>
-        <w:t xml:space="preserve"> Up</w:t>
+        <w:t>POO Shoot’Em Up</w:t>
       </w:r>
     </w:p>
     <w:p>
@@ -35,7 +27,13 @@
     <w:sdt>
       <w:sdtPr>
         <w:rPr>
-          <w:lang w:val="fr-FR"/>
+          <w:rFonts w:asciiTheme="minorHAnsi" w:eastAsiaTheme="minorHAnsi" w:hAnsiTheme="minorHAnsi" w:cstheme="minorBidi"/>
+          <w:color w:val="auto"/>
+          <w:kern w:val="2"/>
+          <w:sz w:val="24"/>
+          <w:szCs w:val="24"/>
+          <w:lang w:val="fr-FR" w:eastAsia="en-US"/>
+          <w14:ligatures w14:val="standardContextual"/>
         </w:rPr>
         <w:id w:val="896398568"/>
         <w:docPartObj>
@@ -45,15 +43,8 @@
       </w:sdtPr>
       <w:sdtEndPr>
         <w:rPr>
-          <w:rFonts w:asciiTheme="minorHAnsi" w:eastAsiaTheme="minorHAnsi" w:hAnsiTheme="minorHAnsi" w:cstheme="minorBidi"/>
           <w:b/>
           <w:bCs/>
-          <w:color w:val="auto"/>
-          <w:kern w:val="2"/>
-          <w:sz w:val="24"/>
-          <w:szCs w:val="24"/>
-          <w:lang w:eastAsia="en-US"/>
-          <w14:ligatures w14:val="standardContextual"/>
         </w:rPr>
       </w:sdtEndPr>
       <w:sdtContent>
@@ -1162,76 +1153,37 @@
       <w:pPr>
         <w:spacing w:after="40"/>
         <w:jc w:val="center"/>
-        <w:rPr>
-          <w:lang w:val="en-US"/>
-        </w:rPr>
-      </w:pPr>
-      <w:r>
-        <w:rPr>
-          <w:lang w:val="en-US"/>
-        </w:rPr>
+      </w:pPr>
+      <w:r>
         <w:t>Auteur:</w:t>
       </w:r>
       <w:r>
-        <w:rPr>
-          <w:lang w:val="en-US"/>
-        </w:rPr>
-        <w:t xml:space="preserve"> </w:t>
-      </w:r>
-      <w:r>
-        <w:rPr>
-          <w:lang w:val="en-US"/>
-        </w:rPr>
-        <w:t>Nathan Schmid</w:t>
+        <w:t xml:space="preserve"> Nathan Schmid</w:t>
       </w:r>
     </w:p>
     <w:p>
       <w:pPr>
         <w:spacing w:after="40"/>
         <w:jc w:val="center"/>
-        <w:rPr>
-          <w:lang w:val="en-US"/>
-        </w:rPr>
-      </w:pPr>
-      <w:r>
-        <w:rPr>
-          <w:lang w:val="en-US"/>
-        </w:rPr>
+      </w:pPr>
+      <w:r>
         <w:t xml:space="preserve">Du 28.08 au </w:t>
       </w:r>
       <w:r>
-        <w:rPr>
-          <w:lang w:val="en-US"/>
-        </w:rPr>
         <w:t>30.10</w:t>
       </w:r>
     </w:p>
-    <w:p>
-      <w:pPr>
-        <w:rPr>
-          <w:lang w:val="en-US"/>
-        </w:rPr>
-      </w:pPr>
-    </w:p>
+    <w:p/>
     <w:p>
       <w:pPr>
         <w:pStyle w:val="Titre1"/>
-        <w:rPr>
-          <w:lang w:val="en-US"/>
-        </w:rPr>
       </w:pPr>
       <w:bookmarkStart w:id="0" w:name="_Toc239427039"/>
       <w:r>
-        <w:rPr>
-          <w:lang w:val="en-US"/>
-        </w:rPr>
         <w:t>Introduction</w:t>
       </w:r>
       <w:bookmarkEnd w:id="0"/>
       <w:r>
-        <w:rPr>
-          <w:lang w:val="en-US"/>
-        </w:rPr>
         <w:t xml:space="preserve"> </w:t>
       </w:r>
     </w:p>
@@ -1242,15 +1194,7 @@
     </w:p>
     <w:p>
       <w:r>
-        <w:t>Le jeu aura comme idée de base « </w:t>
-      </w:r>
-      <w:proofErr w:type="spellStart"/>
-      <w:r>
-        <w:t>Shoot’Em</w:t>
-      </w:r>
-      <w:proofErr w:type="spellEnd"/>
-      <w:r>
-        <w:t xml:space="preserve"> UP » et il sera revisité de manière créative par l’élève charger de ce travail.</w:t>
+        <w:t>Le jeu aura comme idée de base « Shoot’Em UP » et il sera revisité de manière créative par l’élève charger de ce travail.</w:t>
       </w:r>
     </w:p>
     <w:p>
@@ -1370,34 +1314,16 @@
     <w:p>
       <w:pPr>
         <w:pStyle w:val="Titre2"/>
-        <w:rPr>
-          <w:lang w:val="en-US"/>
-        </w:rPr>
       </w:pPr>
       <w:bookmarkStart w:id="5" w:name="_Toc239427044"/>
       <w:r>
-        <w:rPr>
-          <w:lang w:val="en-US"/>
-        </w:rPr>
         <w:t>U.S</w:t>
       </w:r>
       <w:r>
-        <w:rPr>
-          <w:lang w:val="en-US"/>
-        </w:rPr>
         <w:t xml:space="preserve"> /</w:t>
       </w:r>
       <w:r>
-        <w:rPr>
-          <w:lang w:val="en-US"/>
-        </w:rPr>
-        <w:t xml:space="preserve"> user s</w:t>
-      </w:r>
-      <w:r>
-        <w:rPr>
-          <w:lang w:val="en-US"/>
-        </w:rPr>
-        <w:t>tories</w:t>
+        <w:t xml:space="preserve"> user stories</w:t>
       </w:r>
       <w:bookmarkEnd w:id="5"/>
     </w:p>
@@ -1460,31 +1386,7 @@
         </w:numPr>
       </w:pPr>
       <w:r>
-        <w:t xml:space="preserve">Si le joueur reste appuyé sur la touche </w:t>
-      </w:r>
-      <w:r>
-        <w:t>D</w:t>
-      </w:r>
-      <w:r>
-        <w:t xml:space="preserve"> ou </w:t>
-      </w:r>
-      <w:r>
-        <w:t>→</w:t>
-      </w:r>
-      <w:r>
-        <w:t xml:space="preserve"> alors le personnage du joueur se déplacera sur la gauche tant que je joueur reste appuyé sur les touches </w:t>
-      </w:r>
-      <w:r>
-        <w:t>D</w:t>
-      </w:r>
-      <w:r>
-        <w:t xml:space="preserve"> ou </w:t>
-      </w:r>
-      <w:r>
-        <w:t>→</w:t>
-      </w:r>
-      <w:r>
-        <w:t>.</w:t>
+        <w:t>Si le joueur reste appuyé sur la touche D ou → alors le personnage du joueur se déplacera sur la gauche tant que je joueur reste appuyé sur les touches D ou →.</w:t>
       </w:r>
     </w:p>
     <w:p>
@@ -1497,16 +1399,7 @@
       </w:pPr>
       <w:r>
         <w:lastRenderedPageBreak/>
-        <w:t xml:space="preserve">Si le joueur lâche les touches </w:t>
-      </w:r>
-      <w:r>
-        <w:t>D</w:t>
-      </w:r>
-      <w:r>
-        <w:t xml:space="preserve"> ou </w:t>
-      </w:r>
-      <w:r>
-        <w:t>→</w:t>
+        <w:t>Si le joueur lâche les touches D ou →</w:t>
       </w:r>
       <w:r>
         <w:t xml:space="preserve">, </w:t>
@@ -1524,19 +1417,7 @@
         </w:numPr>
       </w:pPr>
       <w:r>
-        <w:t xml:space="preserve">Si le joueur appuie simultanément sur les touches </w:t>
-      </w:r>
-      <w:r>
-        <w:t>D</w:t>
-      </w:r>
-      <w:r>
-        <w:t xml:space="preserve"> et </w:t>
-      </w:r>
-      <w:r>
-        <w:t>→</w:t>
-      </w:r>
-      <w:r>
-        <w:t xml:space="preserve"> le personnage se déplacera sur la gauche.</w:t>
+        <w:t>Si le joueur appuie simultanément sur les touches D et → le personnage se déplacera sur la gauche.</w:t>
       </w:r>
     </w:p>
     <w:p>
@@ -1715,6 +1596,30 @@
     </w:p>
     <w:p>
       <w:pPr>
+        <w:pStyle w:val="Paragraphedeliste"/>
+        <w:numPr>
+          <w:ilvl w:val="0"/>
+          <w:numId w:val="1"/>
+        </w:numPr>
+      </w:pPr>
+      <w:r>
+        <w:t>Finir la partie analyse, les US, le rapport de projet etc etc…</w:t>
+      </w:r>
+    </w:p>
+    <w:p>
+      <w:pPr>
+        <w:pStyle w:val="Paragraphedeliste"/>
+        <w:numPr>
+          <w:ilvl w:val="0"/>
+          <w:numId w:val="1"/>
+        </w:numPr>
+      </w:pPr>
+      <w:r>
+        <w:t>Commencer la US sur les déplacements du Joueur.</w:t>
+      </w:r>
+    </w:p>
+    <w:p>
+      <w:pPr>
         <w:pStyle w:val="Titre2"/>
       </w:pPr>
       <w:bookmarkStart w:id="10" w:name="_Toc239427049"/>
@@ -1725,6 +1630,30 @@
     </w:p>
     <w:p>
       <w:pPr>
+        <w:pStyle w:val="Paragraphedeliste"/>
+        <w:numPr>
+          <w:ilvl w:val="0"/>
+          <w:numId w:val="1"/>
+        </w:numPr>
+      </w:pPr>
+      <w:r>
+        <w:t>Finir les déplacements du joueur et mettre la US en DONE.</w:t>
+      </w:r>
+    </w:p>
+    <w:p>
+      <w:pPr>
+        <w:pStyle w:val="Paragraphedeliste"/>
+        <w:numPr>
+          <w:ilvl w:val="0"/>
+          <w:numId w:val="1"/>
+        </w:numPr>
+      </w:pPr>
+      <w:r>
+        <w:t>Faire la US des projectiles du joueur.</w:t>
+      </w:r>
+    </w:p>
+    <w:p>
+      <w:pPr>
         <w:pStyle w:val="Titre2"/>
       </w:pPr>
       <w:bookmarkStart w:id="11" w:name="_Toc239427050"/>
@@ -1732,6 +1661,64 @@
         <w:t>Semaine 5</w:t>
       </w:r>
       <w:bookmarkEnd w:id="11"/>
+    </w:p>
+    <w:p>
+      <w:pPr>
+        <w:pStyle w:val="Paragraphedeliste"/>
+        <w:numPr>
+          <w:ilvl w:val="0"/>
+          <w:numId w:val="1"/>
+        </w:numPr>
+      </w:pPr>
+      <w:r>
+        <w:t>US sur les ennemis, créer les premières guêpes.</w:t>
+      </w:r>
+    </w:p>
+    <w:p>
+      <w:pPr>
+        <w:pStyle w:val="Paragraphedeliste"/>
+        <w:numPr>
+          <w:ilvl w:val="0"/>
+          <w:numId w:val="1"/>
+        </w:numPr>
+      </w:pPr>
+      <w:r>
+        <w:t>US sur les projectiles ennemis.</w:t>
+      </w:r>
+    </w:p>
+    <w:p>
+      <w:pPr>
+        <w:pStyle w:val="Titre2"/>
+      </w:pPr>
+      <w:bookmarkStart w:id="12" w:name="_Toc239427051"/>
+      <w:r>
+        <w:t>Semaine 6</w:t>
+      </w:r>
+      <w:bookmarkEnd w:id="12"/>
+    </w:p>
+    <w:p>
+      <w:pPr>
+        <w:pStyle w:val="Paragraphedeliste"/>
+        <w:numPr>
+          <w:ilvl w:val="0"/>
+          <w:numId w:val="1"/>
+        </w:numPr>
+      </w:pPr>
+      <w:r>
+        <w:t>US sur les défenses du joueur, création des moyens de défense du joueur.</w:t>
+      </w:r>
+    </w:p>
+    <w:p>
+      <w:pPr>
+        <w:pStyle w:val="Paragraphedeliste"/>
+        <w:numPr>
+          <w:ilvl w:val="0"/>
+          <w:numId w:val="1"/>
+        </w:numPr>
+      </w:pPr>
+      <w:r>
+        <w:t>Création de l’interface de jeu avec le fond et les couleurs du jeux.</w:t>
+      </w:r>
     </w:p>
     <w:p>
       <w:pPr>
@@ -1740,22 +1727,57 @@
           <w:lang w:val="en-US"/>
         </w:rPr>
       </w:pPr>
-      <w:bookmarkStart w:id="12" w:name="_Toc239427051"/>
-      <w:proofErr w:type="spellStart"/>
+      <w:bookmarkStart w:id="13" w:name="_Toc239427052"/>
       <w:r>
         <w:rPr>
           <w:lang w:val="en-US"/>
         </w:rPr>
-        <w:t>Semaine</w:t>
-      </w:r>
-      <w:proofErr w:type="spellEnd"/>
-      <w:r>
-        <w:rPr>
-          <w:lang w:val="en-US"/>
-        </w:rPr>
-        <w:t xml:space="preserve"> 6</w:t>
-      </w:r>
-      <w:bookmarkEnd w:id="12"/>
+        <w:lastRenderedPageBreak/>
+        <w:t>Semaine 7</w:t>
+      </w:r>
+      <w:bookmarkEnd w:id="13"/>
+    </w:p>
+    <w:p>
+      <w:pPr>
+        <w:pStyle w:val="Paragraphedeliste"/>
+        <w:numPr>
+          <w:ilvl w:val="0"/>
+          <w:numId w:val="1"/>
+        </w:numPr>
+      </w:pPr>
+      <w:r>
+        <w:t>US sur les scores, a</w:t>
+      </w:r>
+      <w:r>
+        <w:t>jout du score du joueur avec des points qui s’accumulent.</w:t>
+      </w:r>
+    </w:p>
+    <w:p>
+      <w:pPr>
+        <w:pStyle w:val="Paragraphedeliste"/>
+        <w:numPr>
+          <w:ilvl w:val="0"/>
+          <w:numId w:val="1"/>
+        </w:numPr>
+      </w:pPr>
+      <w:r>
+        <w:t>Gestions de la victoire et de la défaite</w:t>
+      </w:r>
+      <w:r>
+        <w:t>.</w:t>
+      </w:r>
+    </w:p>
+    <w:p>
+      <w:pPr>
+        <w:pStyle w:val="Paragraphedeliste"/>
+        <w:numPr>
+          <w:ilvl w:val="0"/>
+          <w:numId w:val="1"/>
+        </w:numPr>
+      </w:pPr>
+      <w:r>
+        <w:t>Terminer le rapport de projet.</w:t>
+      </w:r>
     </w:p>
     <w:p>
       <w:pPr>
@@ -1764,54 +1786,34 @@
           <w:lang w:val="en-US"/>
         </w:rPr>
       </w:pPr>
-      <w:bookmarkStart w:id="13" w:name="_Toc239427052"/>
-      <w:proofErr w:type="spellStart"/>
+      <w:bookmarkStart w:id="14" w:name="_Toc239427053"/>
       <w:r>
         <w:rPr>
           <w:lang w:val="en-US"/>
         </w:rPr>
-        <w:t>Semaine</w:t>
-      </w:r>
-      <w:proofErr w:type="spellEnd"/>
-      <w:r>
-        <w:rPr>
-          <w:lang w:val="en-US"/>
-        </w:rPr>
-        <w:t xml:space="preserve"> 7</w:t>
-      </w:r>
-      <w:bookmarkEnd w:id="13"/>
-    </w:p>
-    <w:p>
-      <w:pPr>
-        <w:pStyle w:val="Titre2"/>
-        <w:rPr>
-          <w:lang w:val="en-US"/>
-        </w:rPr>
-      </w:pPr>
-      <w:bookmarkStart w:id="14" w:name="_Toc239427053"/>
-      <w:proofErr w:type="spellStart"/>
-      <w:r>
-        <w:rPr>
-          <w:lang w:val="en-US"/>
-        </w:rPr>
-        <w:t>Semaine</w:t>
-      </w:r>
-      <w:proofErr w:type="spellEnd"/>
-      <w:r>
-        <w:rPr>
-          <w:lang w:val="en-US"/>
-        </w:rPr>
-        <w:t xml:space="preserve"> 8</w:t>
+        <w:t>Semaine 8</w:t>
       </w:r>
       <w:bookmarkEnd w:id="14"/>
     </w:p>
     <w:p>
       <w:pPr>
-        <w:rPr>
-          <w:lang w:val="en-US"/>
-        </w:rPr>
-      </w:pPr>
-    </w:p>
+        <w:pStyle w:val="Paragraphedeliste"/>
+        <w:numPr>
+          <w:ilvl w:val="0"/>
+          <w:numId w:val="1"/>
+        </w:numPr>
+      </w:pPr>
+      <w:r>
+        <w:t xml:space="preserve">BONUS : si le temps le </w:t>
+      </w:r>
+      <w:r>
+        <w:t>permet</w:t>
+      </w:r>
+      <w:r>
+        <w:t>, ajout de pouvoir pour le joueur (lancer plus de projectile, plus de vie, plus de vitesse).</w:t>
+      </w:r>
+    </w:p>
+    <w:p/>
     <w:sectPr>
       <w:pgSz w:w="11906" w:h="16838"/>
       <w:pgMar w:top="1417" w:right="1417" w:bottom="1417" w:left="1417" w:header="708" w:footer="708" w:gutter="0"/>
@@ -2661,6 +2663,7 @@
   <w:style w:type="character" w:default="1" w:styleId="Policepardfaut">
     <w:name w:val="Default Paragraph Font"/>
     <w:uiPriority w:val="1"/>
+    <w:semiHidden/>
     <w:unhideWhenUsed/>
   </w:style>
   <w:style w:type="table" w:default="1" w:styleId="TableauNormal">
@@ -3348,23 +3351,10 @@
 </file>
 
 <file path=customXml/item1.xml><?xml version="1.0" encoding="utf-8"?>
-<p:properties xmlns:p="http://schemas.microsoft.com/office/2006/metadata/properties" xmlns:xsi="http://www.w3.org/2001/XMLSchema-instance" xmlns:pc="http://schemas.microsoft.com/office/infopath/2007/PartnerControls">
-  <documentManagement>
-    <_activity xmlns="6cf9629a-3f6c-4f5f-bf5a-9990f6d83c58" xsi:nil="true"/>
-  </documentManagement>
-</p:properties>
+<b:Sources xmlns:b="http://schemas.openxmlformats.org/officeDocument/2006/bibliography" xmlns="http://schemas.openxmlformats.org/officeDocument/2006/bibliography" SelectedStyle="\APASixthEditionOfficeOnline.xsl" StyleName="APA" Version="6"/>
 </file>
 
 <file path=customXml/item2.xml><?xml version="1.0" encoding="utf-8"?>
-<?mso-contentType ?>
-<FormTemplates xmlns="http://schemas.microsoft.com/sharepoint/v3/contenttype/forms">
-  <Display>DocumentLibraryForm</Display>
-  <Edit>DocumentLibraryForm</Edit>
-  <New>DocumentLibraryForm</New>
-</FormTemplates>
-</file>
-
-<file path=customXml/item3.xml><?xml version="1.0" encoding="utf-8"?>
 <ct:contentTypeSchema xmlns:ct="http://schemas.microsoft.com/office/2006/metadata/contentType" xmlns:ma="http://schemas.microsoft.com/office/2006/metadata/properties/metaAttributes" ct:_="" ma:_="" ma:contentTypeName="Document" ma:contentTypeID="0x0101008A44E17421B74B4385ED2944255AEAB1" ma:contentTypeVersion="15" ma:contentTypeDescription="Crée un document." ma:contentTypeScope="" ma:versionID="93b5b18248b291ae417a942065f70d11">
   <xsd:schema xmlns:xsd="http://www.w3.org/2001/XMLSchema" xmlns:xs="http://www.w3.org/2001/XMLSchema" xmlns:p="http://schemas.microsoft.com/office/2006/metadata/properties" xmlns:ns3="6cf9629a-3f6c-4f5f-bf5a-9990f6d83c58" xmlns:ns4="ef367ba7-2429-4e09-a0d8-fa435a6b45cb" targetNamespace="http://schemas.microsoft.com/office/2006/metadata/properties" ma:root="true" ma:fieldsID="eb702e15d063576a5a91b0ad2108833a" ns3:_="" ns4:_="">
     <xsd:import namespace="6cf9629a-3f6c-4f5f-bf5a-9990f6d83c58"/>
@@ -3597,29 +3587,32 @@
 </ct:contentTypeSchema>
 </file>
 
+<file path=customXml/item3.xml><?xml version="1.0" encoding="utf-8"?>
+<?mso-contentType ?>
+<FormTemplates xmlns="http://schemas.microsoft.com/sharepoint/v3/contenttype/forms">
+  <Display>DocumentLibraryForm</Display>
+  <Edit>DocumentLibraryForm</Edit>
+  <New>DocumentLibraryForm</New>
+</FormTemplates>
+</file>
+
 <file path=customXml/item4.xml><?xml version="1.0" encoding="utf-8"?>
-<b:Sources xmlns:b="http://schemas.openxmlformats.org/officeDocument/2006/bibliography" xmlns="http://schemas.openxmlformats.org/officeDocument/2006/bibliography" SelectedStyle="\APASixthEditionOfficeOnline.xsl" StyleName="APA" Version="6"/>
+<p:properties xmlns:p="http://schemas.microsoft.com/office/2006/metadata/properties" xmlns:xsi="http://www.w3.org/2001/XMLSchema-instance" xmlns:pc="http://schemas.microsoft.com/office/infopath/2007/PartnerControls">
+  <documentManagement>
+    <_activity xmlns="6cf9629a-3f6c-4f5f-bf5a-9990f6d83c58" xsi:nil="true"/>
+  </documentManagement>
+</p:properties>
 </file>
 
 <file path=customXml/itemProps1.xml><?xml version="1.0" encoding="utf-8"?>
-<ds:datastoreItem xmlns:ds="http://schemas.openxmlformats.org/officeDocument/2006/customXml" ds:itemID="{FC71E993-84B4-48D2-950C-13C131ED85B2}">
+<ds:datastoreItem xmlns:ds="http://schemas.openxmlformats.org/officeDocument/2006/customXml" ds:itemID="{2C53BA18-DBA6-435B-B859-AC3BE7A8B3B8}">
   <ds:schemaRefs>
-    <ds:schemaRef ds:uri="http://schemas.microsoft.com/office/2006/metadata/properties"/>
-    <ds:schemaRef ds:uri="http://schemas.microsoft.com/office/infopath/2007/PartnerControls"/>
-    <ds:schemaRef ds:uri="6cf9629a-3f6c-4f5f-bf5a-9990f6d83c58"/>
+    <ds:schemaRef ds:uri="http://schemas.openxmlformats.org/officeDocument/2006/bibliography"/>
   </ds:schemaRefs>
 </ds:datastoreItem>
 </file>
 
 <file path=customXml/itemProps2.xml><?xml version="1.0" encoding="utf-8"?>
-<ds:datastoreItem xmlns:ds="http://schemas.openxmlformats.org/officeDocument/2006/customXml" ds:itemID="{FEB6B610-A6D6-49E3-96B6-D5561D46B112}">
-  <ds:schemaRefs>
-    <ds:schemaRef ds:uri="http://schemas.microsoft.com/sharepoint/v3/contenttype/forms"/>
-  </ds:schemaRefs>
-</ds:datastoreItem>
-</file>
-
-<file path=customXml/itemProps3.xml><?xml version="1.0" encoding="utf-8"?>
 <ds:datastoreItem xmlns:ds="http://schemas.openxmlformats.org/officeDocument/2006/customXml" ds:itemID="{4B077741-96F4-4963-97B4-37B81EC3BF78}">
   <ds:schemaRefs>
     <ds:schemaRef ds:uri="http://schemas.microsoft.com/office/2006/metadata/contentType"/>
@@ -3638,10 +3631,20 @@
 </ds:datastoreItem>
 </file>
 
+<file path=customXml/itemProps3.xml><?xml version="1.0" encoding="utf-8"?>
+<ds:datastoreItem xmlns:ds="http://schemas.openxmlformats.org/officeDocument/2006/customXml" ds:itemID="{FEB6B610-A6D6-49E3-96B6-D5561D46B112}">
+  <ds:schemaRefs>
+    <ds:schemaRef ds:uri="http://schemas.microsoft.com/sharepoint/v3/contenttype/forms"/>
+  </ds:schemaRefs>
+</ds:datastoreItem>
+</file>
+
 <file path=customXml/itemProps4.xml><?xml version="1.0" encoding="utf-8"?>
-<ds:datastoreItem xmlns:ds="http://schemas.openxmlformats.org/officeDocument/2006/customXml" ds:itemID="{2C53BA18-DBA6-435B-B859-AC3BE7A8B3B8}">
+<ds:datastoreItem xmlns:ds="http://schemas.openxmlformats.org/officeDocument/2006/customXml" ds:itemID="{FC71E993-84B4-48D2-950C-13C131ED85B2}">
   <ds:schemaRefs>
-    <ds:schemaRef ds:uri="http://schemas.openxmlformats.org/officeDocument/2006/bibliography"/>
+    <ds:schemaRef ds:uri="http://schemas.microsoft.com/office/2006/metadata/properties"/>
+    <ds:schemaRef ds:uri="http://schemas.microsoft.com/office/infopath/2007/PartnerControls"/>
+    <ds:schemaRef ds:uri="6cf9629a-3f6c-4f5f-bf5a-9990f6d83c58"/>
   </ds:schemaRefs>
 </ds:datastoreItem>
 </file>
</xml_diff>

<commit_message>
doc(JDT): remplir le journal de travail
[20][DONE]
</commit_message>
<xml_diff>
--- a/docs/R-320-POO-SchmidNathan-Rapport.docx
+++ b/docs/R-320-POO-SchmidNathan-Rapport.docx
@@ -8,7 +8,15 @@
         <w:jc w:val="center"/>
       </w:pPr>
       <w:r>
-        <w:t>POO Shoot’Em Up</w:t>
+        <w:t xml:space="preserve">POO </w:t>
+      </w:r>
+      <w:proofErr w:type="spellStart"/>
+      <w:r>
+        <w:t>Shoot’Em</w:t>
+      </w:r>
+      <w:proofErr w:type="spellEnd"/>
+      <w:r>
+        <w:t xml:space="preserve"> Up</w:t>
       </w:r>
     </w:p>
     <w:p>
@@ -1194,7 +1202,15 @@
     </w:p>
     <w:p>
       <w:r>
-        <w:t>Le jeu aura comme idée de base « Shoot’Em UP » et il sera revisité de manière créative par l’élève charger de ce travail.</w:t>
+        <w:t>Le jeu aura comme idée de base « </w:t>
+      </w:r>
+      <w:proofErr w:type="spellStart"/>
+      <w:r>
+        <w:t>Shoot’Em</w:t>
+      </w:r>
+      <w:proofErr w:type="spellEnd"/>
+      <w:r>
+        <w:t xml:space="preserve"> UP » et il sera revisité de manière créative par l’élève charger de ce travail.</w:t>
       </w:r>
     </w:p>
     <w:p>
@@ -1603,7 +1619,15 @@
         </w:numPr>
       </w:pPr>
       <w:r>
-        <w:t>Finir la partie analyse, les US, le rapport de projet etc etc…</w:t>
+        <w:t xml:space="preserve">Finir la partie analyse, les US, le rapport de projet </w:t>
+      </w:r>
+      <w:proofErr w:type="spellStart"/>
+      <w:r>
+        <w:t>etc</w:t>
+      </w:r>
+      <w:proofErr w:type="spellEnd"/>
+      <w:r>
+        <w:t xml:space="preserve"> etc…</w:t>
       </w:r>
     </w:p>
     <w:p>
@@ -1671,8 +1695,24 @@
         </w:numPr>
       </w:pPr>
       <w:r>
-        <w:t>US sur les ennemis, créer les premières guêpes.</w:t>
-      </w:r>
+        <w:t>US sur les ennemis, créer les premières guêpes</w:t>
+      </w:r>
+      <w:r>
+        <w:t>, avec leurs projectiles et leurs déplacements</w:t>
+      </w:r>
+      <w:r>
+        <w:t>.</w:t>
+      </w:r>
+    </w:p>
+    <w:p>
+      <w:pPr>
+        <w:pStyle w:val="Titre2"/>
+      </w:pPr>
+      <w:bookmarkStart w:id="12" w:name="_Toc239427051"/>
+      <w:r>
+        <w:t>Semaine 6</w:t>
+      </w:r>
+      <w:bookmarkEnd w:id="12"/>
     </w:p>
     <w:p>
       <w:pPr>
@@ -1683,18 +1723,8 @@
         </w:numPr>
       </w:pPr>
       <w:r>
-        <w:t>US sur les projectiles ennemis.</w:t>
-      </w:r>
-    </w:p>
-    <w:p>
-      <w:pPr>
-        <w:pStyle w:val="Titre2"/>
-      </w:pPr>
-      <w:bookmarkStart w:id="12" w:name="_Toc239427051"/>
-      <w:r>
-        <w:t>Semaine 6</w:t>
-      </w:r>
-      <w:bookmarkEnd w:id="12"/>
+        <w:t>US sur les défenses du joueur, création des moyens de défense du joueur.</w:t>
+      </w:r>
     </w:p>
     <w:p>
       <w:pPr>
@@ -1705,8 +1735,39 @@
         </w:numPr>
       </w:pPr>
       <w:r>
-        <w:t>US sur les défenses du joueur, création des moyens de défense du joueur.</w:t>
-      </w:r>
+        <w:t xml:space="preserve">Création de l’interface de jeu avec le fond et les couleurs </w:t>
+      </w:r>
+      <w:r>
+        <w:t>du jeu</w:t>
+      </w:r>
+      <w:r>
+        <w:t>.</w:t>
+      </w:r>
+    </w:p>
+    <w:p>
+      <w:pPr>
+        <w:pStyle w:val="Titre2"/>
+        <w:rPr>
+          <w:lang w:val="en-US"/>
+        </w:rPr>
+      </w:pPr>
+      <w:bookmarkStart w:id="13" w:name="_Toc239427052"/>
+      <w:proofErr w:type="spellStart"/>
+      <w:r>
+        <w:rPr>
+          <w:lang w:val="en-US"/>
+        </w:rPr>
+        <w:lastRenderedPageBreak/>
+        <w:t>Semaine</w:t>
+      </w:r>
+      <w:proofErr w:type="spellEnd"/>
+      <w:r>
+        <w:rPr>
+          <w:lang w:val="en-US"/>
+        </w:rPr>
+        <w:t xml:space="preserve"> 7</w:t>
+      </w:r>
+      <w:bookmarkEnd w:id="13"/>
     </w:p>
     <w:p>
       <w:pPr>
@@ -1717,25 +1778,11 @@
         </w:numPr>
       </w:pPr>
       <w:r>
-        <w:t>Création de l’interface de jeu avec le fond et les couleurs du jeux.</w:t>
-      </w:r>
-    </w:p>
-    <w:p>
-      <w:pPr>
-        <w:pStyle w:val="Titre2"/>
-        <w:rPr>
-          <w:lang w:val="en-US"/>
-        </w:rPr>
-      </w:pPr>
-      <w:bookmarkStart w:id="13" w:name="_Toc239427052"/>
-      <w:r>
-        <w:rPr>
-          <w:lang w:val="en-US"/>
-        </w:rPr>
-        <w:lastRenderedPageBreak/>
-        <w:t>Semaine 7</w:t>
-      </w:r>
-      <w:bookmarkEnd w:id="13"/>
+        <w:t>US sur les scores, a</w:t>
+      </w:r>
+      <w:r>
+        <w:t>jout du score du joueur avec des points qui s’accumulent.</w:t>
+      </w:r>
     </w:p>
     <w:p>
       <w:pPr>
@@ -1746,10 +1793,10 @@
         </w:numPr>
       </w:pPr>
       <w:r>
-        <w:t>US sur les scores, a</w:t>
-      </w:r>
-      <w:r>
-        <w:t>jout du score du joueur avec des points qui s’accumulent.</w:t>
+        <w:t>Gestions de la victoire et de la défaite</w:t>
+      </w:r>
+      <w:r>
+        <w:t>.</w:t>
       </w:r>
     </w:p>
     <w:p>
@@ -1761,21 +1808,6 @@
         </w:numPr>
       </w:pPr>
       <w:r>
-        <w:t>Gestions de la victoire et de la défaite</w:t>
-      </w:r>
-      <w:r>
-        <w:t>.</w:t>
-      </w:r>
-    </w:p>
-    <w:p>
-      <w:pPr>
-        <w:pStyle w:val="Paragraphedeliste"/>
-        <w:numPr>
-          <w:ilvl w:val="0"/>
-          <w:numId w:val="1"/>
-        </w:numPr>
-      </w:pPr>
-      <w:r>
         <w:t>Terminer le rapport de projet.</w:t>
       </w:r>
     </w:p>
@@ -1787,11 +1819,19 @@
         </w:rPr>
       </w:pPr>
       <w:bookmarkStart w:id="14" w:name="_Toc239427053"/>
+      <w:proofErr w:type="spellStart"/>
       <w:r>
         <w:rPr>
           <w:lang w:val="en-US"/>
         </w:rPr>
-        <w:t>Semaine 8</w:t>
+        <w:t>Semaine</w:t>
+      </w:r>
+      <w:proofErr w:type="spellEnd"/>
+      <w:r>
+        <w:rPr>
+          <w:lang w:val="en-US"/>
+        </w:rPr>
+        <w:t xml:space="preserve"> 8</w:t>
       </w:r>
       <w:bookmarkEnd w:id="14"/>
     </w:p>

</xml_diff>